<commit_message>
update journal, translation and security
</commit_message>
<xml_diff>
--- a/ReportsAndDocuments/Work&AI_Log.docx
+++ b/ReportsAndDocuments/Work&AI_Log.docx
@@ -23,9 +23,9 @@
         <w:tblLook w:val="04A0" w:firstRow="1" w:lastRow="0" w:firstColumn="1" w:lastColumn="0" w:noHBand="0" w:noVBand="1"/>
       </w:tblPr>
       <w:tblGrid>
-        <w:gridCol w:w="1983"/>
-        <w:gridCol w:w="1416"/>
-        <w:gridCol w:w="6671"/>
+        <w:gridCol w:w="1555"/>
+        <w:gridCol w:w="850"/>
+        <w:gridCol w:w="7665"/>
       </w:tblGrid>
       <w:tr>
         <w:trPr>
@@ -35,7 +35,7 @@
         </w:trPr>
         <w:tc>
           <w:tcPr>
-            <w:tcW w:w="1983" w:type="dxa"/>
+            <w:tcW w:w="1555" w:type="dxa"/>
             <w:shd w:val="clear" w:color="auto" w:fill="EAF0F6"/>
             <w:vAlign w:val="center"/>
           </w:tcPr>
@@ -54,7 +54,7 @@
         </w:tc>
         <w:tc>
           <w:tcPr>
-            <w:tcW w:w="1416" w:type="dxa"/>
+            <w:tcW w:w="850" w:type="dxa"/>
             <w:shd w:val="clear" w:color="auto" w:fill="EAF0F6"/>
             <w:vAlign w:val="center"/>
           </w:tcPr>
@@ -73,7 +73,7 @@
         </w:tc>
         <w:tc>
           <w:tcPr>
-            <w:tcW w:w="6671" w:type="dxa"/>
+            <w:tcW w:w="7665" w:type="dxa"/>
             <w:shd w:val="clear" w:color="auto" w:fill="EAF0F6"/>
             <w:vAlign w:val="center"/>
           </w:tcPr>
@@ -98,7 +98,7 @@
         </w:trPr>
         <w:tc>
           <w:tcPr>
-            <w:tcW w:w="1983" w:type="dxa"/>
+            <w:tcW w:w="1555" w:type="dxa"/>
             <w:vAlign w:val="center"/>
           </w:tcPr>
           <w:p>
@@ -115,7 +115,7 @@
         </w:tc>
         <w:tc>
           <w:tcPr>
-            <w:tcW w:w="1416" w:type="dxa"/>
+            <w:tcW w:w="850" w:type="dxa"/>
             <w:vAlign w:val="center"/>
           </w:tcPr>
           <w:p>
@@ -137,7 +137,7 @@
         </w:tc>
         <w:tc>
           <w:tcPr>
-            <w:tcW w:w="6671" w:type="dxa"/>
+            <w:tcW w:w="7665" w:type="dxa"/>
             <w:vAlign w:val="center"/>
           </w:tcPr>
           <w:p>
@@ -160,7 +160,7 @@
         </w:trPr>
         <w:tc>
           <w:tcPr>
-            <w:tcW w:w="1983" w:type="dxa"/>
+            <w:tcW w:w="1555" w:type="dxa"/>
             <w:vAlign w:val="center"/>
           </w:tcPr>
           <w:p>
@@ -177,7 +177,7 @@
         </w:tc>
         <w:tc>
           <w:tcPr>
-            <w:tcW w:w="1416" w:type="dxa"/>
+            <w:tcW w:w="850" w:type="dxa"/>
             <w:vAlign w:val="center"/>
           </w:tcPr>
           <w:p>
@@ -199,7 +199,7 @@
         </w:tc>
         <w:tc>
           <w:tcPr>
-            <w:tcW w:w="6671" w:type="dxa"/>
+            <w:tcW w:w="7665" w:type="dxa"/>
             <w:vAlign w:val="center"/>
           </w:tcPr>
           <w:p>
@@ -222,7 +222,7 @@
         </w:trPr>
         <w:tc>
           <w:tcPr>
-            <w:tcW w:w="1983" w:type="dxa"/>
+            <w:tcW w:w="1555" w:type="dxa"/>
             <w:vAlign w:val="center"/>
           </w:tcPr>
           <w:p>
@@ -239,7 +239,7 @@
         </w:tc>
         <w:tc>
           <w:tcPr>
-            <w:tcW w:w="1416" w:type="dxa"/>
+            <w:tcW w:w="850" w:type="dxa"/>
             <w:vAlign w:val="center"/>
           </w:tcPr>
           <w:p>
@@ -261,7 +261,7 @@
         </w:tc>
         <w:tc>
           <w:tcPr>
-            <w:tcW w:w="6671" w:type="dxa"/>
+            <w:tcW w:w="7665" w:type="dxa"/>
             <w:vAlign w:val="center"/>
           </w:tcPr>
           <w:p>
@@ -284,7 +284,7 @@
         </w:trPr>
         <w:tc>
           <w:tcPr>
-            <w:tcW w:w="1983" w:type="dxa"/>
+            <w:tcW w:w="1555" w:type="dxa"/>
             <w:vAlign w:val="center"/>
           </w:tcPr>
           <w:p>
@@ -301,7 +301,7 @@
         </w:tc>
         <w:tc>
           <w:tcPr>
-            <w:tcW w:w="1416" w:type="dxa"/>
+            <w:tcW w:w="850" w:type="dxa"/>
             <w:vAlign w:val="center"/>
           </w:tcPr>
           <w:p>
@@ -323,7 +323,7 @@
         </w:tc>
         <w:tc>
           <w:tcPr>
-            <w:tcW w:w="6671" w:type="dxa"/>
+            <w:tcW w:w="7665" w:type="dxa"/>
             <w:vAlign w:val="center"/>
           </w:tcPr>
           <w:p>
@@ -346,7 +346,7 @@
         </w:trPr>
         <w:tc>
           <w:tcPr>
-            <w:tcW w:w="1983" w:type="dxa"/>
+            <w:tcW w:w="1555" w:type="dxa"/>
             <w:vAlign w:val="center"/>
           </w:tcPr>
           <w:p>
@@ -363,7 +363,7 @@
         </w:tc>
         <w:tc>
           <w:tcPr>
-            <w:tcW w:w="1416" w:type="dxa"/>
+            <w:tcW w:w="850" w:type="dxa"/>
             <w:vAlign w:val="center"/>
           </w:tcPr>
           <w:p>
@@ -385,7 +385,7 @@
         </w:tc>
         <w:tc>
           <w:tcPr>
-            <w:tcW w:w="6671" w:type="dxa"/>
+            <w:tcW w:w="7665" w:type="dxa"/>
             <w:vAlign w:val="center"/>
           </w:tcPr>
           <w:p>
@@ -408,7 +408,7 @@
         </w:trPr>
         <w:tc>
           <w:tcPr>
-            <w:tcW w:w="1983" w:type="dxa"/>
+            <w:tcW w:w="1555" w:type="dxa"/>
             <w:vAlign w:val="center"/>
           </w:tcPr>
           <w:p>
@@ -425,7 +425,7 @@
         </w:tc>
         <w:tc>
           <w:tcPr>
-            <w:tcW w:w="1416" w:type="dxa"/>
+            <w:tcW w:w="850" w:type="dxa"/>
             <w:vAlign w:val="center"/>
           </w:tcPr>
           <w:p>
@@ -447,7 +447,7 @@
         </w:tc>
         <w:tc>
           <w:tcPr>
-            <w:tcW w:w="6671" w:type="dxa"/>
+            <w:tcW w:w="7665" w:type="dxa"/>
             <w:vAlign w:val="center"/>
           </w:tcPr>
           <w:p>
@@ -470,7 +470,7 @@
         </w:trPr>
         <w:tc>
           <w:tcPr>
-            <w:tcW w:w="1983" w:type="dxa"/>
+            <w:tcW w:w="1555" w:type="dxa"/>
             <w:vAlign w:val="center"/>
           </w:tcPr>
           <w:p>
@@ -487,7 +487,7 @@
         </w:tc>
         <w:tc>
           <w:tcPr>
-            <w:tcW w:w="1416" w:type="dxa"/>
+            <w:tcW w:w="850" w:type="dxa"/>
             <w:vAlign w:val="center"/>
           </w:tcPr>
           <w:p>
@@ -509,7 +509,7 @@
         </w:tc>
         <w:tc>
           <w:tcPr>
-            <w:tcW w:w="6671" w:type="dxa"/>
+            <w:tcW w:w="7665" w:type="dxa"/>
             <w:vAlign w:val="center"/>
           </w:tcPr>
           <w:p>
@@ -532,7 +532,7 @@
         </w:trPr>
         <w:tc>
           <w:tcPr>
-            <w:tcW w:w="1983" w:type="dxa"/>
+            <w:tcW w:w="1555" w:type="dxa"/>
             <w:vAlign w:val="center"/>
           </w:tcPr>
           <w:p>
@@ -549,7 +549,7 @@
         </w:tc>
         <w:tc>
           <w:tcPr>
-            <w:tcW w:w="1416" w:type="dxa"/>
+            <w:tcW w:w="850" w:type="dxa"/>
             <w:vAlign w:val="center"/>
           </w:tcPr>
           <w:p>
@@ -571,7 +571,7 @@
         </w:tc>
         <w:tc>
           <w:tcPr>
-            <w:tcW w:w="6671" w:type="dxa"/>
+            <w:tcW w:w="7665" w:type="dxa"/>
             <w:vAlign w:val="center"/>
           </w:tcPr>
           <w:p>
@@ -594,7 +594,7 @@
         </w:trPr>
         <w:tc>
           <w:tcPr>
-            <w:tcW w:w="1983" w:type="dxa"/>
+            <w:tcW w:w="1555" w:type="dxa"/>
             <w:vAlign w:val="center"/>
           </w:tcPr>
           <w:p>
@@ -611,7 +611,7 @@
         </w:tc>
         <w:tc>
           <w:tcPr>
-            <w:tcW w:w="1416" w:type="dxa"/>
+            <w:tcW w:w="850" w:type="dxa"/>
             <w:vAlign w:val="center"/>
           </w:tcPr>
           <w:p>
@@ -633,7 +633,7 @@
         </w:tc>
         <w:tc>
           <w:tcPr>
-            <w:tcW w:w="6671" w:type="dxa"/>
+            <w:tcW w:w="7665" w:type="dxa"/>
             <w:vAlign w:val="center"/>
           </w:tcPr>
           <w:p>
@@ -656,7 +656,7 @@
         </w:trPr>
         <w:tc>
           <w:tcPr>
-            <w:tcW w:w="1983" w:type="dxa"/>
+            <w:tcW w:w="1555" w:type="dxa"/>
             <w:vAlign w:val="center"/>
           </w:tcPr>
           <w:p>
@@ -673,7 +673,7 @@
         </w:tc>
         <w:tc>
           <w:tcPr>
-            <w:tcW w:w="1416" w:type="dxa"/>
+            <w:tcW w:w="850" w:type="dxa"/>
             <w:vAlign w:val="center"/>
           </w:tcPr>
           <w:p>
@@ -695,7 +695,7 @@
         </w:tc>
         <w:tc>
           <w:tcPr>
-            <w:tcW w:w="6671" w:type="dxa"/>
+            <w:tcW w:w="7665" w:type="dxa"/>
             <w:vAlign w:val="center"/>
           </w:tcPr>
           <w:p>
@@ -718,14 +718,13 @@
         </w:trPr>
         <w:tc>
           <w:tcPr>
-            <w:tcW w:w="1983" w:type="dxa"/>
+            <w:tcW w:w="1555" w:type="dxa"/>
             <w:vAlign w:val="center"/>
           </w:tcPr>
           <w:p>
             <w:pPr>
               <w:spacing w:after="0"/>
               <w:rPr>
-                <w:rFonts w:hint="eastAsia"/>
                 <w:sz w:val="16"/>
                 <w:lang w:eastAsia="zh-CN"/>
               </w:rPr>
@@ -742,14 +741,13 @@
         </w:tc>
         <w:tc>
           <w:tcPr>
-            <w:tcW w:w="1416" w:type="dxa"/>
+            <w:tcW w:w="850" w:type="dxa"/>
             <w:vAlign w:val="center"/>
           </w:tcPr>
           <w:p>
             <w:pPr>
               <w:spacing w:after="0"/>
               <w:rPr>
-                <w:rFonts w:hint="eastAsia"/>
                 <w:sz w:val="16"/>
                 <w:lang w:eastAsia="zh-CN"/>
               </w:rPr>
@@ -766,14 +764,13 @@
         </w:tc>
         <w:tc>
           <w:tcPr>
-            <w:tcW w:w="6671" w:type="dxa"/>
+            <w:tcW w:w="7665" w:type="dxa"/>
             <w:vAlign w:val="center"/>
           </w:tcPr>
           <w:p>
             <w:pPr>
               <w:spacing w:after="0"/>
               <w:rPr>
-                <w:rFonts w:hint="eastAsia"/>
                 <w:sz w:val="16"/>
                 <w:lang w:val="en-CA" w:eastAsia="zh-CN"/>
               </w:rPr>
@@ -795,14 +792,13 @@
         </w:trPr>
         <w:tc>
           <w:tcPr>
-            <w:tcW w:w="1983" w:type="dxa"/>
+            <w:tcW w:w="1555" w:type="dxa"/>
             <w:vAlign w:val="center"/>
           </w:tcPr>
           <w:p>
             <w:pPr>
               <w:spacing w:after="0"/>
               <w:rPr>
-                <w:rFonts w:hint="eastAsia"/>
                 <w:sz w:val="16"/>
                 <w:lang w:eastAsia="zh-CN"/>
               </w:rPr>
@@ -819,14 +815,13 @@
         </w:tc>
         <w:tc>
           <w:tcPr>
-            <w:tcW w:w="1416" w:type="dxa"/>
+            <w:tcW w:w="850" w:type="dxa"/>
             <w:vAlign w:val="center"/>
           </w:tcPr>
           <w:p>
             <w:pPr>
               <w:spacing w:after="0"/>
               <w:rPr>
-                <w:rFonts w:hint="eastAsia"/>
                 <w:sz w:val="16"/>
                 <w:lang w:eastAsia="zh-CN"/>
               </w:rPr>
@@ -843,14 +838,13 @@
         </w:tc>
         <w:tc>
           <w:tcPr>
-            <w:tcW w:w="6671" w:type="dxa"/>
+            <w:tcW w:w="7665" w:type="dxa"/>
             <w:vAlign w:val="center"/>
           </w:tcPr>
           <w:p>
             <w:pPr>
               <w:spacing w:after="0"/>
               <w:rPr>
-                <w:rFonts w:hint="eastAsia"/>
                 <w:sz w:val="16"/>
                 <w:lang w:eastAsia="zh-CN"/>
               </w:rPr>
@@ -880,14 +874,13 @@
         </w:trPr>
         <w:tc>
           <w:tcPr>
-            <w:tcW w:w="1983" w:type="dxa"/>
+            <w:tcW w:w="1555" w:type="dxa"/>
             <w:vAlign w:val="center"/>
           </w:tcPr>
           <w:p>
             <w:pPr>
               <w:spacing w:after="0"/>
               <w:rPr>
-                <w:rFonts w:hint="eastAsia"/>
                 <w:sz w:val="16"/>
                 <w:lang w:eastAsia="zh-CN"/>
               </w:rPr>
@@ -904,14 +897,13 @@
         </w:tc>
         <w:tc>
           <w:tcPr>
-            <w:tcW w:w="1416" w:type="dxa"/>
+            <w:tcW w:w="850" w:type="dxa"/>
             <w:vAlign w:val="center"/>
           </w:tcPr>
           <w:p>
             <w:pPr>
               <w:spacing w:after="0"/>
               <w:rPr>
-                <w:rFonts w:hint="eastAsia"/>
                 <w:sz w:val="16"/>
                 <w:lang w:eastAsia="zh-CN"/>
               </w:rPr>
@@ -928,14 +920,13 @@
         </w:tc>
         <w:tc>
           <w:tcPr>
-            <w:tcW w:w="6671" w:type="dxa"/>
+            <w:tcW w:w="7665" w:type="dxa"/>
             <w:vAlign w:val="center"/>
           </w:tcPr>
           <w:p>
             <w:pPr>
               <w:spacing w:after="0"/>
               <w:rPr>
-                <w:rFonts w:hint="eastAsia"/>
                 <w:sz w:val="16"/>
                 <w:lang w:eastAsia="zh-CN"/>
               </w:rPr>
@@ -964,14 +955,13 @@
         </w:trPr>
         <w:tc>
           <w:tcPr>
-            <w:tcW w:w="1983" w:type="dxa"/>
+            <w:tcW w:w="1555" w:type="dxa"/>
             <w:vAlign w:val="center"/>
           </w:tcPr>
           <w:p>
             <w:pPr>
               <w:spacing w:after="0"/>
               <w:rPr>
-                <w:rFonts w:hint="eastAsia"/>
                 <w:sz w:val="16"/>
                 <w:lang w:eastAsia="zh-CN"/>
               </w:rPr>
@@ -988,14 +978,13 @@
         </w:tc>
         <w:tc>
           <w:tcPr>
-            <w:tcW w:w="1416" w:type="dxa"/>
+            <w:tcW w:w="850" w:type="dxa"/>
             <w:vAlign w:val="center"/>
           </w:tcPr>
           <w:p>
             <w:pPr>
               <w:spacing w:after="0"/>
               <w:rPr>
-                <w:rFonts w:hint="eastAsia"/>
                 <w:sz w:val="16"/>
                 <w:lang w:eastAsia="zh-CN"/>
               </w:rPr>
@@ -1012,14 +1001,13 @@
         </w:tc>
         <w:tc>
           <w:tcPr>
-            <w:tcW w:w="6671" w:type="dxa"/>
+            <w:tcW w:w="7665" w:type="dxa"/>
             <w:vAlign w:val="center"/>
           </w:tcPr>
           <w:p>
             <w:pPr>
               <w:spacing w:after="0"/>
               <w:rPr>
-                <w:rFonts w:hint="eastAsia"/>
                 <w:sz w:val="16"/>
                 <w:lang w:eastAsia="zh-CN"/>
               </w:rPr>
@@ -1055,14 +1043,13 @@
         </w:trPr>
         <w:tc>
           <w:tcPr>
-            <w:tcW w:w="1983" w:type="dxa"/>
+            <w:tcW w:w="1555" w:type="dxa"/>
             <w:vAlign w:val="center"/>
           </w:tcPr>
           <w:p>
             <w:pPr>
               <w:spacing w:after="0"/>
               <w:rPr>
-                <w:rFonts w:hint="eastAsia"/>
                 <w:sz w:val="16"/>
                 <w:lang w:eastAsia="zh-CN"/>
               </w:rPr>
@@ -1079,14 +1066,13 @@
         </w:tc>
         <w:tc>
           <w:tcPr>
-            <w:tcW w:w="1416" w:type="dxa"/>
+            <w:tcW w:w="850" w:type="dxa"/>
             <w:vAlign w:val="center"/>
           </w:tcPr>
           <w:p>
             <w:pPr>
               <w:spacing w:after="0"/>
               <w:rPr>
-                <w:rFonts w:hint="eastAsia"/>
                 <w:sz w:val="16"/>
                 <w:lang w:eastAsia="zh-CN"/>
               </w:rPr>
@@ -1103,7 +1089,7 @@
         </w:tc>
         <w:tc>
           <w:tcPr>
-            <w:tcW w:w="6671" w:type="dxa"/>
+            <w:tcW w:w="7665" w:type="dxa"/>
             <w:vAlign w:val="center"/>
           </w:tcPr>
           <w:p>
@@ -1129,14 +1115,13 @@
         </w:trPr>
         <w:tc>
           <w:tcPr>
-            <w:tcW w:w="1983" w:type="dxa"/>
+            <w:tcW w:w="1555" w:type="dxa"/>
             <w:vAlign w:val="center"/>
           </w:tcPr>
           <w:p>
             <w:pPr>
               <w:spacing w:after="0"/>
               <w:rPr>
-                <w:rFonts w:hint="eastAsia"/>
                 <w:sz w:val="16"/>
                 <w:lang w:eastAsia="zh-CN"/>
               </w:rPr>
@@ -1153,14 +1138,13 @@
         </w:tc>
         <w:tc>
           <w:tcPr>
-            <w:tcW w:w="1416" w:type="dxa"/>
+            <w:tcW w:w="850" w:type="dxa"/>
             <w:vAlign w:val="center"/>
           </w:tcPr>
           <w:p>
             <w:pPr>
               <w:spacing w:after="0"/>
               <w:rPr>
-                <w:rFonts w:hint="eastAsia"/>
                 <w:sz w:val="16"/>
                 <w:lang w:eastAsia="zh-CN"/>
               </w:rPr>
@@ -1177,7 +1161,7 @@
         </w:tc>
         <w:tc>
           <w:tcPr>
-            <w:tcW w:w="6671" w:type="dxa"/>
+            <w:tcW w:w="7665" w:type="dxa"/>
             <w:vAlign w:val="center"/>
           </w:tcPr>
           <w:p>
@@ -1203,14 +1187,13 @@
         </w:trPr>
         <w:tc>
           <w:tcPr>
-            <w:tcW w:w="1983" w:type="dxa"/>
+            <w:tcW w:w="1555" w:type="dxa"/>
             <w:vAlign w:val="center"/>
           </w:tcPr>
           <w:p>
             <w:pPr>
               <w:spacing w:after="0"/>
               <w:rPr>
-                <w:rFonts w:hint="eastAsia"/>
                 <w:sz w:val="16"/>
                 <w:lang w:eastAsia="zh-CN"/>
               </w:rPr>
@@ -1227,14 +1210,13 @@
         </w:tc>
         <w:tc>
           <w:tcPr>
-            <w:tcW w:w="1416" w:type="dxa"/>
+            <w:tcW w:w="850" w:type="dxa"/>
             <w:vAlign w:val="center"/>
           </w:tcPr>
           <w:p>
             <w:pPr>
               <w:spacing w:after="0"/>
               <w:rPr>
-                <w:rFonts w:hint="eastAsia"/>
                 <w:sz w:val="16"/>
                 <w:lang w:eastAsia="zh-CN"/>
               </w:rPr>
@@ -1251,14 +1233,13 @@
         </w:tc>
         <w:tc>
           <w:tcPr>
-            <w:tcW w:w="6671" w:type="dxa"/>
+            <w:tcW w:w="7665" w:type="dxa"/>
             <w:vAlign w:val="center"/>
           </w:tcPr>
           <w:p>
             <w:pPr>
               <w:spacing w:after="0"/>
               <w:rPr>
-                <w:rFonts w:hint="eastAsia"/>
                 <w:sz w:val="16"/>
                 <w:lang w:eastAsia="zh-CN"/>
               </w:rPr>
@@ -1281,14 +1262,13 @@
         </w:trPr>
         <w:tc>
           <w:tcPr>
-            <w:tcW w:w="1983" w:type="dxa"/>
+            <w:tcW w:w="1555" w:type="dxa"/>
             <w:vAlign w:val="center"/>
           </w:tcPr>
           <w:p>
             <w:pPr>
               <w:spacing w:after="0"/>
               <w:rPr>
-                <w:rFonts w:hint="eastAsia"/>
                 <w:sz w:val="16"/>
                 <w:lang w:eastAsia="zh-CN"/>
               </w:rPr>
@@ -1305,14 +1285,13 @@
         </w:tc>
         <w:tc>
           <w:tcPr>
-            <w:tcW w:w="1416" w:type="dxa"/>
+            <w:tcW w:w="850" w:type="dxa"/>
             <w:vAlign w:val="center"/>
           </w:tcPr>
           <w:p>
             <w:pPr>
               <w:spacing w:after="0"/>
               <w:rPr>
-                <w:rFonts w:hint="eastAsia"/>
                 <w:sz w:val="16"/>
                 <w:lang w:eastAsia="zh-CN"/>
               </w:rPr>
@@ -1329,14 +1308,13 @@
         </w:tc>
         <w:tc>
           <w:tcPr>
-            <w:tcW w:w="6671" w:type="dxa"/>
+            <w:tcW w:w="7665" w:type="dxa"/>
             <w:vAlign w:val="center"/>
           </w:tcPr>
           <w:p>
             <w:pPr>
               <w:spacing w:after="0"/>
               <w:rPr>
-                <w:rFonts w:hint="eastAsia"/>
                 <w:sz w:val="16"/>
                 <w:lang w:eastAsia="zh-CN"/>
               </w:rPr>
@@ -1359,14 +1337,13 @@
         </w:trPr>
         <w:tc>
           <w:tcPr>
-            <w:tcW w:w="1983" w:type="dxa"/>
+            <w:tcW w:w="1555" w:type="dxa"/>
             <w:vAlign w:val="center"/>
           </w:tcPr>
           <w:p>
             <w:pPr>
               <w:spacing w:after="0"/>
               <w:rPr>
-                <w:rFonts w:hint="eastAsia"/>
                 <w:sz w:val="16"/>
                 <w:lang w:eastAsia="zh-CN"/>
               </w:rPr>
@@ -1383,14 +1360,13 @@
         </w:tc>
         <w:tc>
           <w:tcPr>
-            <w:tcW w:w="1416" w:type="dxa"/>
+            <w:tcW w:w="850" w:type="dxa"/>
             <w:vAlign w:val="center"/>
           </w:tcPr>
           <w:p>
             <w:pPr>
               <w:spacing w:after="0"/>
               <w:rPr>
-                <w:rFonts w:hint="eastAsia"/>
                 <w:sz w:val="16"/>
                 <w:lang w:eastAsia="zh-CN"/>
               </w:rPr>
@@ -1407,14 +1383,13 @@
         </w:tc>
         <w:tc>
           <w:tcPr>
-            <w:tcW w:w="6671" w:type="dxa"/>
+            <w:tcW w:w="7665" w:type="dxa"/>
             <w:vAlign w:val="center"/>
           </w:tcPr>
           <w:p>
             <w:pPr>
               <w:spacing w:after="0"/>
               <w:rPr>
-                <w:rFonts w:hint="eastAsia"/>
                 <w:sz w:val="16"/>
                 <w:lang w:eastAsia="zh-CN"/>
               </w:rPr>
@@ -1452,14 +1427,13 @@
         </w:trPr>
         <w:tc>
           <w:tcPr>
-            <w:tcW w:w="1983" w:type="dxa"/>
+            <w:tcW w:w="1555" w:type="dxa"/>
             <w:vAlign w:val="center"/>
           </w:tcPr>
           <w:p>
             <w:pPr>
               <w:spacing w:after="0"/>
               <w:rPr>
-                <w:rFonts w:hint="eastAsia"/>
                 <w:sz w:val="16"/>
                 <w:lang w:eastAsia="zh-CN"/>
               </w:rPr>
@@ -1476,14 +1450,13 @@
         </w:tc>
         <w:tc>
           <w:tcPr>
-            <w:tcW w:w="1416" w:type="dxa"/>
+            <w:tcW w:w="850" w:type="dxa"/>
             <w:vAlign w:val="center"/>
           </w:tcPr>
           <w:p>
             <w:pPr>
               <w:spacing w:after="0"/>
               <w:rPr>
-                <w:rFonts w:hint="eastAsia"/>
                 <w:sz w:val="16"/>
                 <w:lang w:eastAsia="zh-CN"/>
               </w:rPr>
@@ -1500,14 +1473,13 @@
         </w:tc>
         <w:tc>
           <w:tcPr>
-            <w:tcW w:w="6671" w:type="dxa"/>
+            <w:tcW w:w="7665" w:type="dxa"/>
             <w:vAlign w:val="center"/>
           </w:tcPr>
           <w:p>
             <w:pPr>
               <w:spacing w:after="0"/>
               <w:rPr>
-                <w:rFonts w:hint="eastAsia"/>
                 <w:sz w:val="16"/>
                 <w:lang w:eastAsia="zh-CN"/>
               </w:rPr>
@@ -1537,14 +1509,13 @@
         </w:trPr>
         <w:tc>
           <w:tcPr>
-            <w:tcW w:w="1983" w:type="dxa"/>
+            <w:tcW w:w="1555" w:type="dxa"/>
             <w:vAlign w:val="center"/>
           </w:tcPr>
           <w:p>
             <w:pPr>
               <w:spacing w:after="0"/>
               <w:rPr>
-                <w:rFonts w:hint="eastAsia"/>
                 <w:sz w:val="16"/>
                 <w:lang w:eastAsia="zh-CN"/>
               </w:rPr>
@@ -1561,14 +1532,13 @@
         </w:tc>
         <w:tc>
           <w:tcPr>
-            <w:tcW w:w="1416" w:type="dxa"/>
+            <w:tcW w:w="850" w:type="dxa"/>
             <w:vAlign w:val="center"/>
           </w:tcPr>
           <w:p>
             <w:pPr>
               <w:spacing w:after="0"/>
               <w:rPr>
-                <w:rFonts w:hint="eastAsia"/>
                 <w:sz w:val="16"/>
                 <w:lang w:eastAsia="zh-CN"/>
               </w:rPr>
@@ -1585,14 +1555,13 @@
         </w:tc>
         <w:tc>
           <w:tcPr>
-            <w:tcW w:w="6671" w:type="dxa"/>
+            <w:tcW w:w="7665" w:type="dxa"/>
             <w:vAlign w:val="center"/>
           </w:tcPr>
           <w:p>
             <w:pPr>
               <w:spacing w:after="0"/>
               <w:rPr>
-                <w:rFonts w:hint="eastAsia"/>
                 <w:sz w:val="16"/>
                 <w:lang w:eastAsia="zh-CN"/>
               </w:rPr>
@@ -1622,14 +1591,13 @@
         </w:trPr>
         <w:tc>
           <w:tcPr>
-            <w:tcW w:w="1983" w:type="dxa"/>
+            <w:tcW w:w="1555" w:type="dxa"/>
             <w:vAlign w:val="center"/>
           </w:tcPr>
           <w:p>
             <w:pPr>
               <w:spacing w:after="0"/>
               <w:rPr>
-                <w:rFonts w:hint="eastAsia"/>
                 <w:sz w:val="16"/>
                 <w:lang w:eastAsia="zh-CN"/>
               </w:rPr>
@@ -1640,20 +1608,35 @@
                 <w:sz w:val="16"/>
                 <w:lang w:eastAsia="zh-CN"/>
               </w:rPr>
-              <w:t>Oct 10, 2026</w:t>
+              <w:t xml:space="preserve">Oct </w:t>
+            </w:r>
+            <w:r>
+              <w:rPr>
+                <w:rFonts w:hint="eastAsia"/>
+                <w:sz w:val="16"/>
+                <w:lang w:eastAsia="zh-CN"/>
+              </w:rPr>
+              <w:t>5</w:t>
+            </w:r>
+            <w:r>
+              <w:rPr>
+                <w:rFonts w:hint="eastAsia"/>
+                <w:sz w:val="16"/>
+                <w:lang w:eastAsia="zh-CN"/>
+              </w:rPr>
+              <w:t>, 2026</w:t>
             </w:r>
           </w:p>
         </w:tc>
         <w:tc>
           <w:tcPr>
-            <w:tcW w:w="1416" w:type="dxa"/>
+            <w:tcW w:w="850" w:type="dxa"/>
             <w:vAlign w:val="center"/>
           </w:tcPr>
           <w:p>
             <w:pPr>
               <w:spacing w:after="0"/>
               <w:rPr>
-                <w:rFonts w:hint="eastAsia"/>
                 <w:sz w:val="16"/>
                 <w:lang w:eastAsia="zh-CN"/>
               </w:rPr>
@@ -1670,14 +1653,13 @@
         </w:tc>
         <w:tc>
           <w:tcPr>
-            <w:tcW w:w="6671" w:type="dxa"/>
+            <w:tcW w:w="7665" w:type="dxa"/>
             <w:vAlign w:val="center"/>
           </w:tcPr>
           <w:p>
             <w:pPr>
               <w:spacing w:after="0"/>
               <w:rPr>
-                <w:rFonts w:hint="eastAsia"/>
                 <w:sz w:val="16"/>
                 <w:lang w:eastAsia="zh-CN"/>
               </w:rPr>
@@ -1690,6 +1672,365 @@
               </w:rPr>
               <w:t>Design and test the personal investment portfolio part.</w:t>
             </w:r>
+          </w:p>
+        </w:tc>
+      </w:tr>
+      <w:tr>
+        <w:trPr>
+          <w:cantSplit/>
+          <w:jc w:val="center"/>
+        </w:trPr>
+        <w:tc>
+          <w:tcPr>
+            <w:tcW w:w="1555" w:type="dxa"/>
+            <w:vAlign w:val="center"/>
+          </w:tcPr>
+          <w:p>
+            <w:pPr>
+              <w:spacing w:after="0"/>
+              <w:rPr>
+                <w:rFonts w:hint="eastAsia"/>
+                <w:sz w:val="16"/>
+                <w:lang w:eastAsia="zh-CN"/>
+              </w:rPr>
+            </w:pPr>
+            <w:r>
+              <w:rPr>
+                <w:rFonts w:hint="eastAsia"/>
+                <w:sz w:val="16"/>
+                <w:lang w:eastAsia="zh-CN"/>
+              </w:rPr>
+              <w:t>Oct 6, 2026</w:t>
+            </w:r>
+          </w:p>
+        </w:tc>
+        <w:tc>
+          <w:tcPr>
+            <w:tcW w:w="850" w:type="dxa"/>
+            <w:vAlign w:val="center"/>
+          </w:tcPr>
+          <w:p>
+            <w:pPr>
+              <w:spacing w:after="0"/>
+              <w:rPr>
+                <w:rFonts w:hint="eastAsia"/>
+                <w:sz w:val="16"/>
+                <w:lang w:eastAsia="zh-CN"/>
+              </w:rPr>
+            </w:pPr>
+            <w:r>
+              <w:rPr>
+                <w:rFonts w:hint="eastAsia"/>
+                <w:sz w:val="16"/>
+                <w:lang w:eastAsia="zh-CN"/>
+              </w:rPr>
+              <w:t>5</w:t>
+            </w:r>
+          </w:p>
+        </w:tc>
+        <w:tc>
+          <w:tcPr>
+            <w:tcW w:w="7665" w:type="dxa"/>
+            <w:vAlign w:val="center"/>
+          </w:tcPr>
+          <w:p>
+            <w:pPr>
+              <w:spacing w:after="0"/>
+              <w:rPr>
+                <w:rFonts w:hint="eastAsia"/>
+                <w:sz w:val="16"/>
+                <w:lang w:val="en-CA" w:eastAsia="zh-CN"/>
+              </w:rPr>
+            </w:pPr>
+            <w:r>
+              <w:rPr>
+                <w:rFonts w:hint="eastAsia"/>
+                <w:sz w:val="16"/>
+                <w:lang w:eastAsia="zh-CN"/>
+              </w:rPr>
+              <w:t>Add a Journal to record macro updates</w:t>
+            </w:r>
+          </w:p>
+        </w:tc>
+      </w:tr>
+      <w:tr>
+        <w:trPr>
+          <w:cantSplit/>
+          <w:jc w:val="center"/>
+        </w:trPr>
+        <w:tc>
+          <w:tcPr>
+            <w:tcW w:w="1555" w:type="dxa"/>
+            <w:vAlign w:val="center"/>
+          </w:tcPr>
+          <w:p>
+            <w:pPr>
+              <w:spacing w:after="0"/>
+              <w:rPr>
+                <w:rFonts w:hint="eastAsia"/>
+                <w:sz w:val="16"/>
+                <w:lang w:eastAsia="zh-CN"/>
+              </w:rPr>
+            </w:pPr>
+            <w:r>
+              <w:rPr>
+                <w:rFonts w:hint="eastAsia"/>
+                <w:sz w:val="16"/>
+                <w:lang w:eastAsia="zh-CN"/>
+              </w:rPr>
+              <w:t>Oct 7, 2026</w:t>
+            </w:r>
+          </w:p>
+        </w:tc>
+        <w:tc>
+          <w:tcPr>
+            <w:tcW w:w="850" w:type="dxa"/>
+            <w:vAlign w:val="center"/>
+          </w:tcPr>
+          <w:p>
+            <w:pPr>
+              <w:spacing w:after="0"/>
+              <w:rPr>
+                <w:rFonts w:hint="eastAsia"/>
+                <w:sz w:val="16"/>
+                <w:lang w:eastAsia="zh-CN"/>
+              </w:rPr>
+            </w:pPr>
+            <w:r>
+              <w:rPr>
+                <w:rFonts w:hint="eastAsia"/>
+                <w:sz w:val="16"/>
+                <w:lang w:eastAsia="zh-CN"/>
+              </w:rPr>
+              <w:t>2</w:t>
+            </w:r>
+          </w:p>
+        </w:tc>
+        <w:tc>
+          <w:tcPr>
+            <w:tcW w:w="7665" w:type="dxa"/>
+            <w:vAlign w:val="center"/>
+          </w:tcPr>
+          <w:p>
+            <w:pPr>
+              <w:spacing w:after="0"/>
+              <w:rPr>
+                <w:rFonts w:hint="eastAsia"/>
+                <w:sz w:val="16"/>
+                <w:lang w:eastAsia="zh-CN"/>
+              </w:rPr>
+            </w:pPr>
+            <w:r>
+              <w:rPr>
+                <w:rFonts w:hint="eastAsia"/>
+                <w:sz w:val="16"/>
+                <w:lang w:eastAsia="zh-CN"/>
+              </w:rPr>
+              <w:t>Modify Journal page and add Chinese translation function</w:t>
+            </w:r>
+          </w:p>
+        </w:tc>
+      </w:tr>
+      <w:tr>
+        <w:trPr>
+          <w:cantSplit/>
+          <w:jc w:val="center"/>
+        </w:trPr>
+        <w:tc>
+          <w:tcPr>
+            <w:tcW w:w="1555" w:type="dxa"/>
+            <w:vAlign w:val="center"/>
+          </w:tcPr>
+          <w:p>
+            <w:pPr>
+              <w:spacing w:after="0"/>
+              <w:rPr>
+                <w:rFonts w:hint="eastAsia"/>
+                <w:sz w:val="16"/>
+                <w:lang w:eastAsia="zh-CN"/>
+              </w:rPr>
+            </w:pPr>
+            <w:r>
+              <w:rPr>
+                <w:rFonts w:hint="eastAsia"/>
+                <w:sz w:val="16"/>
+                <w:lang w:eastAsia="zh-CN"/>
+              </w:rPr>
+              <w:t>Oct 8, 2026</w:t>
+            </w:r>
+          </w:p>
+        </w:tc>
+        <w:tc>
+          <w:tcPr>
+            <w:tcW w:w="850" w:type="dxa"/>
+            <w:vAlign w:val="center"/>
+          </w:tcPr>
+          <w:p>
+            <w:pPr>
+              <w:spacing w:after="0"/>
+              <w:rPr>
+                <w:rFonts w:hint="eastAsia"/>
+                <w:sz w:val="16"/>
+                <w:lang w:eastAsia="zh-CN"/>
+              </w:rPr>
+            </w:pPr>
+            <w:r>
+              <w:rPr>
+                <w:rFonts w:hint="eastAsia"/>
+                <w:sz w:val="16"/>
+                <w:lang w:eastAsia="zh-CN"/>
+              </w:rPr>
+              <w:t>5</w:t>
+            </w:r>
+          </w:p>
+        </w:tc>
+        <w:tc>
+          <w:tcPr>
+            <w:tcW w:w="7665" w:type="dxa"/>
+            <w:vAlign w:val="center"/>
+          </w:tcPr>
+          <w:p>
+            <w:pPr>
+              <w:spacing w:after="0"/>
+              <w:rPr>
+                <w:sz w:val="16"/>
+                <w:lang w:eastAsia="zh-CN"/>
+              </w:rPr>
+            </w:pPr>
+            <w:r>
+              <w:rPr>
+                <w:rFonts w:hint="eastAsia"/>
+                <w:sz w:val="16"/>
+                <w:lang w:eastAsia="zh-CN"/>
+              </w:rPr>
+              <w:t xml:space="preserve">Update design report and fortify system security </w:t>
+            </w:r>
+          </w:p>
+          <w:p>
+            <w:pPr>
+              <w:spacing w:after="0"/>
+              <w:rPr>
+                <w:rFonts w:hint="eastAsia"/>
+                <w:sz w:val="16"/>
+                <w:lang w:eastAsia="zh-CN"/>
+              </w:rPr>
+            </w:pPr>
+            <w:r>
+              <w:rPr>
+                <w:rFonts w:hint="eastAsia"/>
+                <w:sz w:val="16"/>
+                <w:lang w:eastAsia="zh-CN"/>
+              </w:rPr>
+              <w:t>Modify unclear display of HK stock name</w:t>
+            </w:r>
+          </w:p>
+        </w:tc>
+      </w:tr>
+      <w:tr>
+        <w:trPr>
+          <w:cantSplit/>
+          <w:jc w:val="center"/>
+        </w:trPr>
+        <w:tc>
+          <w:tcPr>
+            <w:tcW w:w="1555" w:type="dxa"/>
+            <w:vAlign w:val="center"/>
+          </w:tcPr>
+          <w:p>
+            <w:pPr>
+              <w:spacing w:after="0"/>
+              <w:rPr>
+                <w:rFonts w:hint="eastAsia"/>
+                <w:sz w:val="16"/>
+                <w:lang w:eastAsia="zh-CN"/>
+              </w:rPr>
+            </w:pPr>
+          </w:p>
+        </w:tc>
+        <w:tc>
+          <w:tcPr>
+            <w:tcW w:w="850" w:type="dxa"/>
+            <w:vAlign w:val="center"/>
+          </w:tcPr>
+          <w:p>
+            <w:pPr>
+              <w:spacing w:after="0"/>
+              <w:rPr>
+                <w:rFonts w:hint="eastAsia"/>
+                <w:sz w:val="16"/>
+                <w:lang w:eastAsia="zh-CN"/>
+              </w:rPr>
+            </w:pPr>
+          </w:p>
+        </w:tc>
+        <w:tc>
+          <w:tcPr>
+            <w:tcW w:w="7665" w:type="dxa"/>
+            <w:vAlign w:val="center"/>
+          </w:tcPr>
+          <w:p>
+            <w:pPr>
+              <w:spacing w:after="0"/>
+              <w:rPr>
+                <w:rFonts w:hint="eastAsia"/>
+                <w:sz w:val="16"/>
+                <w:lang w:eastAsia="zh-CN"/>
+              </w:rPr>
+            </w:pPr>
+          </w:p>
+        </w:tc>
+      </w:tr>
+      <w:tr>
+        <w:trPr>
+          <w:cantSplit/>
+          <w:jc w:val="center"/>
+        </w:trPr>
+        <w:tc>
+          <w:tcPr>
+            <w:tcW w:w="1555" w:type="dxa"/>
+            <w:vAlign w:val="center"/>
+          </w:tcPr>
+          <w:p>
+            <w:pPr>
+              <w:spacing w:after="0"/>
+              <w:rPr>
+                <w:rFonts w:hint="eastAsia"/>
+                <w:sz w:val="16"/>
+                <w:lang w:eastAsia="zh-CN"/>
+              </w:rPr>
+            </w:pPr>
+          </w:p>
+        </w:tc>
+        <w:tc>
+          <w:tcPr>
+            <w:tcW w:w="850" w:type="dxa"/>
+            <w:vAlign w:val="center"/>
+          </w:tcPr>
+          <w:p>
+            <w:pPr>
+              <w:spacing w:after="0"/>
+              <w:rPr>
+                <w:rFonts w:hint="eastAsia"/>
+                <w:sz w:val="16"/>
+                <w:lang w:eastAsia="zh-CN"/>
+              </w:rPr>
+            </w:pPr>
+          </w:p>
+        </w:tc>
+        <w:tc>
+          <w:tcPr>
+            <w:tcW w:w="7665" w:type="dxa"/>
+            <w:vAlign w:val="center"/>
+          </w:tcPr>
+          <w:p>
+            <w:pPr>
+              <w:spacing w:after="0"/>
+              <w:rPr>
+                <w:rFonts w:hint="eastAsia"/>
+                <w:sz w:val="16"/>
+                <w:lang w:eastAsia="zh-CN"/>
+              </w:rPr>
+            </w:pPr>
           </w:p>
         </w:tc>
       </w:tr>

</xml_diff>

<commit_message>
modified for midterm report
</commit_message>
<xml_diff>
--- a/ReportsAndDocuments/Work&AI_Log.docx
+++ b/ReportsAndDocuments/Work&AI_Log.docx
@@ -1689,7 +1689,6 @@
             <w:pPr>
               <w:spacing w:after="0"/>
               <w:rPr>
-                <w:rFonts w:hint="eastAsia"/>
                 <w:sz w:val="16"/>
                 <w:lang w:eastAsia="zh-CN"/>
               </w:rPr>
@@ -1713,7 +1712,6 @@
             <w:pPr>
               <w:spacing w:after="0"/>
               <w:rPr>
-                <w:rFonts w:hint="eastAsia"/>
                 <w:sz w:val="16"/>
                 <w:lang w:eastAsia="zh-CN"/>
               </w:rPr>
@@ -1737,7 +1735,6 @@
             <w:pPr>
               <w:spacing w:after="0"/>
               <w:rPr>
-                <w:rFonts w:hint="eastAsia"/>
                 <w:sz w:val="16"/>
                 <w:lang w:val="en-CA" w:eastAsia="zh-CN"/>
               </w:rPr>
@@ -1767,7 +1764,6 @@
             <w:pPr>
               <w:spacing w:after="0"/>
               <w:rPr>
-                <w:rFonts w:hint="eastAsia"/>
                 <w:sz w:val="16"/>
                 <w:lang w:eastAsia="zh-CN"/>
               </w:rPr>
@@ -1791,7 +1787,6 @@
             <w:pPr>
               <w:spacing w:after="0"/>
               <w:rPr>
-                <w:rFonts w:hint="eastAsia"/>
                 <w:sz w:val="16"/>
                 <w:lang w:eastAsia="zh-CN"/>
               </w:rPr>
@@ -1815,7 +1810,6 @@
             <w:pPr>
               <w:spacing w:after="0"/>
               <w:rPr>
-                <w:rFonts w:hint="eastAsia"/>
                 <w:sz w:val="16"/>
                 <w:lang w:eastAsia="zh-CN"/>
               </w:rPr>
@@ -1845,7 +1839,6 @@
             <w:pPr>
               <w:spacing w:after="0"/>
               <w:rPr>
-                <w:rFonts w:hint="eastAsia"/>
                 <w:sz w:val="16"/>
                 <w:lang w:eastAsia="zh-CN"/>
               </w:rPr>
@@ -1869,7 +1862,6 @@
             <w:pPr>
               <w:spacing w:after="0"/>
               <w:rPr>
-                <w:rFonts w:hint="eastAsia"/>
                 <w:sz w:val="16"/>
                 <w:lang w:eastAsia="zh-CN"/>
               </w:rPr>
@@ -1910,7 +1902,6 @@
             <w:pPr>
               <w:spacing w:after="0"/>
               <w:rPr>
-                <w:rFonts w:hint="eastAsia"/>
                 <w:sz w:val="16"/>
                 <w:lang w:eastAsia="zh-CN"/>
               </w:rPr>
@@ -1945,6 +1936,14 @@
                 <w:lang w:eastAsia="zh-CN"/>
               </w:rPr>
             </w:pPr>
+            <w:r>
+              <w:rPr>
+                <w:rFonts w:hint="eastAsia"/>
+                <w:sz w:val="16"/>
+                <w:lang w:eastAsia="zh-CN"/>
+              </w:rPr>
+              <w:t>Oct 10,2026</w:t>
+            </w:r>
           </w:p>
         </w:tc>
         <w:tc>
@@ -1961,6 +1960,14 @@
                 <w:lang w:eastAsia="zh-CN"/>
               </w:rPr>
             </w:pPr>
+            <w:r>
+              <w:rPr>
+                <w:rFonts w:hint="eastAsia"/>
+                <w:sz w:val="16"/>
+                <w:lang w:eastAsia="zh-CN"/>
+              </w:rPr>
+              <w:t>2</w:t>
+            </w:r>
           </w:p>
         </w:tc>
         <w:tc>
@@ -1972,7 +1979,6 @@
             <w:pPr>
               <w:spacing w:after="0"/>
               <w:rPr>
-                <w:rFonts w:hint="eastAsia"/>
                 <w:sz w:val="16"/>
                 <w:lang w:eastAsia="zh-CN"/>
               </w:rPr>
@@ -1999,6 +2005,14 @@
                 <w:lang w:eastAsia="zh-CN"/>
               </w:rPr>
             </w:pPr>
+            <w:r>
+              <w:rPr>
+                <w:rFonts w:hint="eastAsia"/>
+                <w:sz w:val="16"/>
+                <w:lang w:eastAsia="zh-CN"/>
+              </w:rPr>
+              <w:t>Oct 12, 2026</w:t>
+            </w:r>
           </w:p>
         </w:tc>
         <w:tc>
@@ -2015,6 +2029,14 @@
                 <w:lang w:eastAsia="zh-CN"/>
               </w:rPr>
             </w:pPr>
+            <w:r>
+              <w:rPr>
+                <w:rFonts w:hint="eastAsia"/>
+                <w:sz w:val="16"/>
+                <w:lang w:eastAsia="zh-CN"/>
+              </w:rPr>
+              <w:t>2</w:t>
+            </w:r>
           </w:p>
         </w:tc>
         <w:tc>
@@ -2026,11 +2048,274 @@
             <w:pPr>
               <w:spacing w:after="0"/>
               <w:rPr>
+                <w:sz w:val="16"/>
+                <w:lang w:eastAsia="zh-CN"/>
+              </w:rPr>
+            </w:pPr>
+          </w:p>
+        </w:tc>
+      </w:tr>
+      <w:tr>
+        <w:trPr>
+          <w:cantSplit/>
+          <w:jc w:val="center"/>
+        </w:trPr>
+        <w:tc>
+          <w:tcPr>
+            <w:tcW w:w="1555" w:type="dxa"/>
+            <w:vAlign w:val="center"/>
+          </w:tcPr>
+          <w:p>
+            <w:pPr>
+              <w:spacing w:after="0"/>
+              <w:rPr>
                 <w:rFonts w:hint="eastAsia"/>
                 <w:sz w:val="16"/>
                 <w:lang w:eastAsia="zh-CN"/>
               </w:rPr>
             </w:pPr>
+            <w:r>
+              <w:rPr>
+                <w:rFonts w:hint="eastAsia"/>
+                <w:sz w:val="16"/>
+                <w:lang w:eastAsia="zh-CN"/>
+              </w:rPr>
+              <w:t>Oct 1</w:t>
+            </w:r>
+            <w:r>
+              <w:rPr>
+                <w:rFonts w:hint="eastAsia"/>
+                <w:sz w:val="16"/>
+                <w:lang w:eastAsia="zh-CN"/>
+              </w:rPr>
+              <w:t>3</w:t>
+            </w:r>
+            <w:r>
+              <w:rPr>
+                <w:rFonts w:hint="eastAsia"/>
+                <w:sz w:val="16"/>
+                <w:lang w:eastAsia="zh-CN"/>
+              </w:rPr>
+              <w:t>, 2026</w:t>
+            </w:r>
+          </w:p>
+        </w:tc>
+        <w:tc>
+          <w:tcPr>
+            <w:tcW w:w="850" w:type="dxa"/>
+            <w:vAlign w:val="center"/>
+          </w:tcPr>
+          <w:p>
+            <w:pPr>
+              <w:spacing w:after="0"/>
+              <w:rPr>
+                <w:rFonts w:hint="eastAsia"/>
+                <w:sz w:val="16"/>
+                <w:lang w:eastAsia="zh-CN"/>
+              </w:rPr>
+            </w:pPr>
+            <w:r>
+              <w:rPr>
+                <w:rFonts w:hint="eastAsia"/>
+                <w:sz w:val="16"/>
+                <w:lang w:eastAsia="zh-CN"/>
+              </w:rPr>
+              <w:t>2</w:t>
+            </w:r>
+          </w:p>
+        </w:tc>
+        <w:tc>
+          <w:tcPr>
+            <w:tcW w:w="7665" w:type="dxa"/>
+            <w:vAlign w:val="center"/>
+          </w:tcPr>
+          <w:p>
+            <w:pPr>
+              <w:spacing w:after="0"/>
+              <w:rPr>
+                <w:sz w:val="16"/>
+                <w:lang w:eastAsia="zh-CN"/>
+              </w:rPr>
+            </w:pPr>
+          </w:p>
+        </w:tc>
+      </w:tr>
+      <w:tr>
+        <w:trPr>
+          <w:cantSplit/>
+          <w:jc w:val="center"/>
+        </w:trPr>
+        <w:tc>
+          <w:tcPr>
+            <w:tcW w:w="1555" w:type="dxa"/>
+            <w:vAlign w:val="center"/>
+          </w:tcPr>
+          <w:p>
+            <w:pPr>
+              <w:spacing w:after="0"/>
+              <w:rPr>
+                <w:rFonts w:hint="eastAsia"/>
+                <w:sz w:val="16"/>
+                <w:lang w:eastAsia="zh-CN"/>
+              </w:rPr>
+            </w:pPr>
+            <w:r>
+              <w:rPr>
+                <w:rFonts w:hint="eastAsia"/>
+                <w:sz w:val="16"/>
+                <w:lang w:eastAsia="zh-CN"/>
+              </w:rPr>
+              <w:t>Oct 1</w:t>
+            </w:r>
+            <w:r>
+              <w:rPr>
+                <w:rFonts w:hint="eastAsia"/>
+                <w:sz w:val="16"/>
+                <w:lang w:eastAsia="zh-CN"/>
+              </w:rPr>
+              <w:t>5</w:t>
+            </w:r>
+            <w:r>
+              <w:rPr>
+                <w:rFonts w:hint="eastAsia"/>
+                <w:sz w:val="16"/>
+                <w:lang w:eastAsia="zh-CN"/>
+              </w:rPr>
+              <w:t>, 2026</w:t>
+            </w:r>
+          </w:p>
+        </w:tc>
+        <w:tc>
+          <w:tcPr>
+            <w:tcW w:w="850" w:type="dxa"/>
+            <w:vAlign w:val="center"/>
+          </w:tcPr>
+          <w:p>
+            <w:pPr>
+              <w:spacing w:after="0"/>
+              <w:rPr>
+                <w:rFonts w:hint="eastAsia"/>
+                <w:sz w:val="16"/>
+                <w:lang w:eastAsia="zh-CN"/>
+              </w:rPr>
+            </w:pPr>
+            <w:r>
+              <w:rPr>
+                <w:rFonts w:hint="eastAsia"/>
+                <w:sz w:val="16"/>
+                <w:lang w:eastAsia="zh-CN"/>
+              </w:rPr>
+              <w:t>1</w:t>
+            </w:r>
+          </w:p>
+        </w:tc>
+        <w:tc>
+          <w:tcPr>
+            <w:tcW w:w="7665" w:type="dxa"/>
+            <w:vAlign w:val="center"/>
+          </w:tcPr>
+          <w:p>
+            <w:pPr>
+              <w:spacing w:after="0"/>
+              <w:rPr>
+                <w:sz w:val="16"/>
+                <w:lang w:eastAsia="zh-CN"/>
+              </w:rPr>
+            </w:pPr>
+          </w:p>
+        </w:tc>
+      </w:tr>
+      <w:tr>
+        <w:trPr>
+          <w:cantSplit/>
+          <w:jc w:val="center"/>
+        </w:trPr>
+        <w:tc>
+          <w:tcPr>
+            <w:tcW w:w="1555" w:type="dxa"/>
+            <w:vAlign w:val="center"/>
+          </w:tcPr>
+          <w:p>
+            <w:pPr>
+              <w:spacing w:after="0"/>
+              <w:rPr>
+                <w:rFonts w:hint="eastAsia"/>
+                <w:sz w:val="16"/>
+                <w:lang w:eastAsia="zh-CN"/>
+              </w:rPr>
+            </w:pPr>
+            <w:r>
+              <w:rPr>
+                <w:rFonts w:hint="eastAsia"/>
+                <w:sz w:val="16"/>
+                <w:lang w:eastAsia="zh-CN"/>
+              </w:rPr>
+              <w:t>Oct 1</w:t>
+            </w:r>
+            <w:r>
+              <w:rPr>
+                <w:rFonts w:hint="eastAsia"/>
+                <w:sz w:val="16"/>
+                <w:lang w:eastAsia="zh-CN"/>
+              </w:rPr>
+              <w:t>7</w:t>
+            </w:r>
+            <w:r>
+              <w:rPr>
+                <w:rFonts w:hint="eastAsia"/>
+                <w:sz w:val="16"/>
+                <w:lang w:eastAsia="zh-CN"/>
+              </w:rPr>
+              <w:t>, 2026</w:t>
+            </w:r>
+          </w:p>
+        </w:tc>
+        <w:tc>
+          <w:tcPr>
+            <w:tcW w:w="850" w:type="dxa"/>
+            <w:vAlign w:val="center"/>
+          </w:tcPr>
+          <w:p>
+            <w:pPr>
+              <w:spacing w:after="0"/>
+              <w:rPr>
+                <w:rFonts w:hint="eastAsia"/>
+                <w:sz w:val="16"/>
+                <w:lang w:eastAsia="zh-CN"/>
+              </w:rPr>
+            </w:pPr>
+            <w:r>
+              <w:rPr>
+                <w:rFonts w:hint="eastAsia"/>
+                <w:sz w:val="16"/>
+                <w:lang w:eastAsia="zh-CN"/>
+              </w:rPr>
+              <w:t>3</w:t>
+            </w:r>
+          </w:p>
+        </w:tc>
+        <w:tc>
+          <w:tcPr>
+            <w:tcW w:w="7665" w:type="dxa"/>
+            <w:vAlign w:val="center"/>
+          </w:tcPr>
+          <w:p>
+            <w:pPr>
+              <w:spacing w:after="0"/>
+              <w:rPr>
+                <w:rFonts w:hint="eastAsia"/>
+                <w:sz w:val="16"/>
+                <w:lang w:eastAsia="zh-CN"/>
+              </w:rPr>
+            </w:pPr>
+            <w:r>
+              <w:rPr>
+                <w:rFonts w:hint="eastAsia"/>
+                <w:sz w:val="16"/>
+                <w:lang w:eastAsia="zh-CN"/>
+              </w:rPr>
+              <w:t>Update valuation model, solve currency issue, fix UI</w:t>
+            </w:r>
           </w:p>
         </w:tc>
       </w:tr>
@@ -2084,7 +2369,7 @@
         </w:trPr>
         <w:tc>
           <w:tcPr>
-            <w:tcW w:w="1560" w:type="dxa"/>
+            <w:tcW w:w="1559" w:type="dxa"/>
             <w:shd w:val="clear" w:color="auto" w:fill="EAF0F6"/>
             <w:vAlign w:val="center"/>
           </w:tcPr>
@@ -2103,7 +2388,7 @@
         </w:tc>
         <w:tc>
           <w:tcPr>
-            <w:tcW w:w="5670" w:type="dxa"/>
+            <w:tcW w:w="5664" w:type="dxa"/>
             <w:shd w:val="clear" w:color="auto" w:fill="EAF0F6"/>
             <w:vAlign w:val="center"/>
           </w:tcPr>
@@ -2122,7 +2407,7 @@
         </w:tc>
         <w:tc>
           <w:tcPr>
-            <w:tcW w:w="2850" w:type="dxa"/>
+            <w:tcW w:w="2847" w:type="dxa"/>
             <w:shd w:val="clear" w:color="auto" w:fill="EAF0F6"/>
             <w:vAlign w:val="center"/>
           </w:tcPr>
@@ -2147,7 +2432,7 @@
         </w:trPr>
         <w:tc>
           <w:tcPr>
-            <w:tcW w:w="1560" w:type="dxa"/>
+            <w:tcW w:w="1559" w:type="dxa"/>
             <w:vAlign w:val="center"/>
           </w:tcPr>
           <w:p>
@@ -2167,7 +2452,7 @@
         </w:tc>
         <w:tc>
           <w:tcPr>
-            <w:tcW w:w="5670" w:type="dxa"/>
+            <w:tcW w:w="5664" w:type="dxa"/>
             <w:vAlign w:val="center"/>
           </w:tcPr>
           <w:p>
@@ -2341,7 +2626,7 @@
         </w:tc>
         <w:tc>
           <w:tcPr>
-            <w:tcW w:w="2850" w:type="dxa"/>
+            <w:tcW w:w="2847" w:type="dxa"/>
             <w:vAlign w:val="center"/>
           </w:tcPr>
           <w:p>
@@ -2472,7 +2757,7 @@
         </w:trPr>
         <w:tc>
           <w:tcPr>
-            <w:tcW w:w="1560" w:type="dxa"/>
+            <w:tcW w:w="1559" w:type="dxa"/>
             <w:vAlign w:val="center"/>
           </w:tcPr>
           <w:p>
@@ -2486,7 +2771,7 @@
         </w:tc>
         <w:tc>
           <w:tcPr>
-            <w:tcW w:w="5670" w:type="dxa"/>
+            <w:tcW w:w="5664" w:type="dxa"/>
             <w:vAlign w:val="center"/>
           </w:tcPr>
           <w:p>
@@ -2594,7 +2879,7 @@
         </w:tc>
         <w:tc>
           <w:tcPr>
-            <w:tcW w:w="2850" w:type="dxa"/>
+            <w:tcW w:w="2847" w:type="dxa"/>
             <w:vAlign w:val="center"/>
           </w:tcPr>
           <w:p>
@@ -2614,7 +2899,7 @@
         </w:trPr>
         <w:tc>
           <w:tcPr>
-            <w:tcW w:w="1560" w:type="dxa"/>
+            <w:tcW w:w="1559" w:type="dxa"/>
             <w:vAlign w:val="center"/>
           </w:tcPr>
           <w:p>
@@ -2634,7 +2919,7 @@
         </w:tc>
         <w:tc>
           <w:tcPr>
-            <w:tcW w:w="5670" w:type="dxa"/>
+            <w:tcW w:w="5664" w:type="dxa"/>
             <w:vAlign w:val="center"/>
           </w:tcPr>
           <w:p>
@@ -2654,7 +2939,7 @@
         </w:tc>
         <w:tc>
           <w:tcPr>
-            <w:tcW w:w="2850" w:type="dxa"/>
+            <w:tcW w:w="2847" w:type="dxa"/>
             <w:vAlign w:val="center"/>
           </w:tcPr>
           <w:p>
@@ -2680,7 +2965,7 @@
         </w:trPr>
         <w:tc>
           <w:tcPr>
-            <w:tcW w:w="1560" w:type="dxa"/>
+            <w:tcW w:w="1559" w:type="dxa"/>
             <w:vAlign w:val="center"/>
           </w:tcPr>
           <w:p>
@@ -2694,7 +2979,7 @@
         </w:tc>
         <w:tc>
           <w:tcPr>
-            <w:tcW w:w="5670" w:type="dxa"/>
+            <w:tcW w:w="5664" w:type="dxa"/>
             <w:vAlign w:val="center"/>
           </w:tcPr>
           <w:p>
@@ -2714,7 +2999,7 @@
         </w:tc>
         <w:tc>
           <w:tcPr>
-            <w:tcW w:w="2850" w:type="dxa"/>
+            <w:tcW w:w="2847" w:type="dxa"/>
             <w:vAlign w:val="center"/>
           </w:tcPr>
           <w:p>
@@ -2762,7 +3047,7 @@
         </w:trPr>
         <w:tc>
           <w:tcPr>
-            <w:tcW w:w="1560" w:type="dxa"/>
+            <w:tcW w:w="1559" w:type="dxa"/>
             <w:vAlign w:val="center"/>
           </w:tcPr>
           <w:p>
@@ -2776,7 +3061,7 @@
         </w:tc>
         <w:tc>
           <w:tcPr>
-            <w:tcW w:w="5670" w:type="dxa"/>
+            <w:tcW w:w="5664" w:type="dxa"/>
             <w:vAlign w:val="center"/>
           </w:tcPr>
           <w:p>
@@ -2796,7 +3081,7 @@
         </w:tc>
         <w:tc>
           <w:tcPr>
-            <w:tcW w:w="2850" w:type="dxa"/>
+            <w:tcW w:w="2847" w:type="dxa"/>
             <w:vAlign w:val="center"/>
           </w:tcPr>
           <w:p>
@@ -2823,7 +3108,7 @@
         </w:trPr>
         <w:tc>
           <w:tcPr>
-            <w:tcW w:w="1560" w:type="dxa"/>
+            <w:tcW w:w="1559" w:type="dxa"/>
             <w:vAlign w:val="center"/>
           </w:tcPr>
           <w:p>
@@ -2837,7 +3122,7 @@
         </w:tc>
         <w:tc>
           <w:tcPr>
-            <w:tcW w:w="5670" w:type="dxa"/>
+            <w:tcW w:w="5664" w:type="dxa"/>
             <w:vAlign w:val="center"/>
           </w:tcPr>
           <w:p>
@@ -2857,7 +3142,7 @@
         </w:tc>
         <w:tc>
           <w:tcPr>
-            <w:tcW w:w="2850" w:type="dxa"/>
+            <w:tcW w:w="2847" w:type="dxa"/>
             <w:vAlign w:val="center"/>
           </w:tcPr>
           <w:p>
@@ -2890,7 +3175,7 @@
         </w:trPr>
         <w:tc>
           <w:tcPr>
-            <w:tcW w:w="1560" w:type="dxa"/>
+            <w:tcW w:w="1559" w:type="dxa"/>
             <w:vAlign w:val="center"/>
           </w:tcPr>
           <w:p>
@@ -2910,7 +3195,7 @@
         </w:tc>
         <w:tc>
           <w:tcPr>
-            <w:tcW w:w="5670" w:type="dxa"/>
+            <w:tcW w:w="5664" w:type="dxa"/>
             <w:vAlign w:val="center"/>
           </w:tcPr>
           <w:p>
@@ -2930,7 +3215,7 @@
         </w:tc>
         <w:tc>
           <w:tcPr>
-            <w:tcW w:w="2850" w:type="dxa"/>
+            <w:tcW w:w="2847" w:type="dxa"/>
             <w:vAlign w:val="center"/>
           </w:tcPr>
           <w:p>
@@ -2956,7 +3241,7 @@
         </w:trPr>
         <w:tc>
           <w:tcPr>
-            <w:tcW w:w="1560" w:type="dxa"/>
+            <w:tcW w:w="1559" w:type="dxa"/>
             <w:vAlign w:val="center"/>
           </w:tcPr>
           <w:p>
@@ -2970,7 +3255,7 @@
         </w:tc>
         <w:tc>
           <w:tcPr>
-            <w:tcW w:w="5670" w:type="dxa"/>
+            <w:tcW w:w="5664" w:type="dxa"/>
             <w:vAlign w:val="center"/>
           </w:tcPr>
           <w:p>
@@ -2990,7 +3275,7 @@
         </w:tc>
         <w:tc>
           <w:tcPr>
-            <w:tcW w:w="2850" w:type="dxa"/>
+            <w:tcW w:w="2847" w:type="dxa"/>
             <w:vAlign w:val="center"/>
           </w:tcPr>
           <w:p>
@@ -3036,7 +3321,7 @@
         </w:trPr>
         <w:tc>
           <w:tcPr>
-            <w:tcW w:w="1560" w:type="dxa"/>
+            <w:tcW w:w="1559" w:type="dxa"/>
             <w:vAlign w:val="center"/>
           </w:tcPr>
           <w:p>
@@ -3056,7 +3341,7 @@
         </w:tc>
         <w:tc>
           <w:tcPr>
-            <w:tcW w:w="5670" w:type="dxa"/>
+            <w:tcW w:w="5664" w:type="dxa"/>
             <w:vAlign w:val="center"/>
           </w:tcPr>
           <w:p>
@@ -3076,7 +3361,7 @@
         </w:tc>
         <w:tc>
           <w:tcPr>
-            <w:tcW w:w="2850" w:type="dxa"/>
+            <w:tcW w:w="2847" w:type="dxa"/>
             <w:vAlign w:val="center"/>
           </w:tcPr>
           <w:p>
@@ -3102,7 +3387,7 @@
         </w:trPr>
         <w:tc>
           <w:tcPr>
-            <w:tcW w:w="1560" w:type="dxa"/>
+            <w:tcW w:w="1559" w:type="dxa"/>
             <w:vAlign w:val="center"/>
           </w:tcPr>
           <w:p>
@@ -3116,7 +3401,7 @@
         </w:tc>
         <w:tc>
           <w:tcPr>
-            <w:tcW w:w="5670" w:type="dxa"/>
+            <w:tcW w:w="5664" w:type="dxa"/>
             <w:vAlign w:val="center"/>
           </w:tcPr>
           <w:p>
@@ -3136,7 +3421,7 @@
         </w:tc>
         <w:tc>
           <w:tcPr>
-            <w:tcW w:w="2850" w:type="dxa"/>
+            <w:tcW w:w="2847" w:type="dxa"/>
             <w:vAlign w:val="center"/>
           </w:tcPr>
           <w:p>
@@ -3169,7 +3454,7 @@
         </w:trPr>
         <w:tc>
           <w:tcPr>
-            <w:tcW w:w="1560" w:type="dxa"/>
+            <w:tcW w:w="1559" w:type="dxa"/>
             <w:vAlign w:val="center"/>
           </w:tcPr>
           <w:p>
@@ -3183,7 +3468,7 @@
         </w:tc>
         <w:tc>
           <w:tcPr>
-            <w:tcW w:w="5670" w:type="dxa"/>
+            <w:tcW w:w="5664" w:type="dxa"/>
             <w:vAlign w:val="center"/>
           </w:tcPr>
           <w:p>
@@ -3217,7 +3502,7 @@
         </w:tc>
         <w:tc>
           <w:tcPr>
-            <w:tcW w:w="2850" w:type="dxa"/>
+            <w:tcW w:w="2847" w:type="dxa"/>
             <w:vAlign w:val="center"/>
           </w:tcPr>
           <w:p>
@@ -3243,7 +3528,7 @@
         </w:trPr>
         <w:tc>
           <w:tcPr>
-            <w:tcW w:w="1560" w:type="dxa"/>
+            <w:tcW w:w="1559" w:type="dxa"/>
             <w:vAlign w:val="center"/>
           </w:tcPr>
           <w:p>
@@ -3263,7 +3548,7 @@
         </w:tc>
         <w:tc>
           <w:tcPr>
-            <w:tcW w:w="5670" w:type="dxa"/>
+            <w:tcW w:w="5664" w:type="dxa"/>
             <w:vAlign w:val="center"/>
           </w:tcPr>
           <w:p>
@@ -3283,7 +3568,7 @@
         </w:tc>
         <w:tc>
           <w:tcPr>
-            <w:tcW w:w="2850" w:type="dxa"/>
+            <w:tcW w:w="2847" w:type="dxa"/>
             <w:vAlign w:val="center"/>
           </w:tcPr>
           <w:p>
@@ -3309,7 +3594,7 @@
         </w:trPr>
         <w:tc>
           <w:tcPr>
-            <w:tcW w:w="1560" w:type="dxa"/>
+            <w:tcW w:w="1559" w:type="dxa"/>
             <w:vAlign w:val="center"/>
           </w:tcPr>
           <w:p>
@@ -3329,7 +3614,7 @@
         </w:tc>
         <w:tc>
           <w:tcPr>
-            <w:tcW w:w="5670" w:type="dxa"/>
+            <w:tcW w:w="5664" w:type="dxa"/>
             <w:vAlign w:val="center"/>
           </w:tcPr>
           <w:p>
@@ -3349,7 +3634,7 @@
         </w:tc>
         <w:tc>
           <w:tcPr>
-            <w:tcW w:w="2850" w:type="dxa"/>
+            <w:tcW w:w="2847" w:type="dxa"/>
             <w:vAlign w:val="center"/>
           </w:tcPr>
           <w:p>
@@ -3365,6 +3650,314 @@
               </w:rPr>
               <w:t>Use one primary case, small validation set, simple evaluation, and limited valuation support.</w:t>
             </w:r>
+          </w:p>
+        </w:tc>
+      </w:tr>
+      <w:tr>
+        <w:trPr>
+          <w:cantSplit/>
+          <w:jc w:val="center"/>
+        </w:trPr>
+        <w:tc>
+          <w:tcPr>
+            <w:tcW w:w="1559" w:type="dxa"/>
+            <w:vAlign w:val="center"/>
+          </w:tcPr>
+          <w:p>
+            <w:pPr>
+              <w:spacing w:after="0"/>
+              <w:rPr>
+                <w:rFonts w:hint="eastAsia"/>
+                <w:sz w:val="16"/>
+                <w:lang w:eastAsia="zh-CN"/>
+              </w:rPr>
+            </w:pPr>
+            <w:r>
+              <w:rPr>
+                <w:rFonts w:hint="eastAsia"/>
+                <w:sz w:val="16"/>
+                <w:lang w:eastAsia="zh-CN"/>
+              </w:rPr>
+              <w:t xml:space="preserve"> </w:t>
+            </w:r>
+          </w:p>
+        </w:tc>
+        <w:tc>
+          <w:tcPr>
+            <w:tcW w:w="5664" w:type="dxa"/>
+            <w:vAlign w:val="center"/>
+          </w:tcPr>
+          <w:p>
+            <w:pPr>
+              <w:spacing w:after="0"/>
+              <w:rPr>
+                <w:sz w:val="16"/>
+              </w:rPr>
+            </w:pPr>
+          </w:p>
+        </w:tc>
+        <w:tc>
+          <w:tcPr>
+            <w:tcW w:w="2847" w:type="dxa"/>
+            <w:vAlign w:val="center"/>
+          </w:tcPr>
+          <w:p>
+            <w:pPr>
+              <w:spacing w:after="0"/>
+              <w:rPr>
+                <w:sz w:val="16"/>
+              </w:rPr>
+            </w:pPr>
+          </w:p>
+        </w:tc>
+      </w:tr>
+      <w:tr>
+        <w:trPr>
+          <w:cantSplit/>
+          <w:jc w:val="center"/>
+        </w:trPr>
+        <w:tc>
+          <w:tcPr>
+            <w:tcW w:w="1559" w:type="dxa"/>
+            <w:vAlign w:val="center"/>
+          </w:tcPr>
+          <w:p>
+            <w:pPr>
+              <w:spacing w:after="0"/>
+              <w:rPr>
+                <w:rFonts w:hint="eastAsia"/>
+                <w:sz w:val="16"/>
+                <w:lang w:eastAsia="zh-CN"/>
+              </w:rPr>
+            </w:pPr>
+          </w:p>
+        </w:tc>
+        <w:tc>
+          <w:tcPr>
+            <w:tcW w:w="5664" w:type="dxa"/>
+            <w:vAlign w:val="center"/>
+          </w:tcPr>
+          <w:p>
+            <w:pPr>
+              <w:spacing w:after="0"/>
+              <w:rPr>
+                <w:sz w:val="16"/>
+              </w:rPr>
+            </w:pPr>
+          </w:p>
+        </w:tc>
+        <w:tc>
+          <w:tcPr>
+            <w:tcW w:w="2847" w:type="dxa"/>
+            <w:vAlign w:val="center"/>
+          </w:tcPr>
+          <w:p>
+            <w:pPr>
+              <w:spacing w:after="0"/>
+              <w:rPr>
+                <w:sz w:val="16"/>
+              </w:rPr>
+            </w:pPr>
+          </w:p>
+        </w:tc>
+      </w:tr>
+      <w:tr>
+        <w:trPr>
+          <w:cantSplit/>
+          <w:jc w:val="center"/>
+        </w:trPr>
+        <w:tc>
+          <w:tcPr>
+            <w:tcW w:w="1559" w:type="dxa"/>
+            <w:vAlign w:val="center"/>
+          </w:tcPr>
+          <w:p>
+            <w:pPr>
+              <w:spacing w:after="0"/>
+              <w:rPr>
+                <w:rFonts w:hint="eastAsia"/>
+                <w:sz w:val="16"/>
+                <w:lang w:eastAsia="zh-CN"/>
+              </w:rPr>
+            </w:pPr>
+          </w:p>
+        </w:tc>
+        <w:tc>
+          <w:tcPr>
+            <w:tcW w:w="5664" w:type="dxa"/>
+            <w:vAlign w:val="center"/>
+          </w:tcPr>
+          <w:p>
+            <w:pPr>
+              <w:spacing w:after="0"/>
+              <w:rPr>
+                <w:sz w:val="16"/>
+              </w:rPr>
+            </w:pPr>
+          </w:p>
+        </w:tc>
+        <w:tc>
+          <w:tcPr>
+            <w:tcW w:w="2847" w:type="dxa"/>
+            <w:vAlign w:val="center"/>
+          </w:tcPr>
+          <w:p>
+            <w:pPr>
+              <w:spacing w:after="0"/>
+              <w:rPr>
+                <w:sz w:val="16"/>
+              </w:rPr>
+            </w:pPr>
+          </w:p>
+        </w:tc>
+      </w:tr>
+      <w:tr>
+        <w:trPr>
+          <w:cantSplit/>
+          <w:jc w:val="center"/>
+        </w:trPr>
+        <w:tc>
+          <w:tcPr>
+            <w:tcW w:w="1559" w:type="dxa"/>
+            <w:vAlign w:val="center"/>
+          </w:tcPr>
+          <w:p>
+            <w:pPr>
+              <w:spacing w:after="0"/>
+              <w:rPr>
+                <w:rFonts w:hint="eastAsia"/>
+                <w:sz w:val="16"/>
+                <w:lang w:eastAsia="zh-CN"/>
+              </w:rPr>
+            </w:pPr>
+          </w:p>
+        </w:tc>
+        <w:tc>
+          <w:tcPr>
+            <w:tcW w:w="5664" w:type="dxa"/>
+            <w:vAlign w:val="center"/>
+          </w:tcPr>
+          <w:p>
+            <w:pPr>
+              <w:spacing w:after="0"/>
+              <w:rPr>
+                <w:sz w:val="16"/>
+              </w:rPr>
+            </w:pPr>
+          </w:p>
+        </w:tc>
+        <w:tc>
+          <w:tcPr>
+            <w:tcW w:w="2847" w:type="dxa"/>
+            <w:vAlign w:val="center"/>
+          </w:tcPr>
+          <w:p>
+            <w:pPr>
+              <w:spacing w:after="0"/>
+              <w:rPr>
+                <w:sz w:val="16"/>
+              </w:rPr>
+            </w:pPr>
+          </w:p>
+        </w:tc>
+      </w:tr>
+      <w:tr>
+        <w:trPr>
+          <w:cantSplit/>
+          <w:jc w:val="center"/>
+        </w:trPr>
+        <w:tc>
+          <w:tcPr>
+            <w:tcW w:w="1559" w:type="dxa"/>
+            <w:vAlign w:val="center"/>
+          </w:tcPr>
+          <w:p>
+            <w:pPr>
+              <w:spacing w:after="0"/>
+              <w:rPr>
+                <w:rFonts w:hint="eastAsia"/>
+                <w:sz w:val="16"/>
+                <w:lang w:eastAsia="zh-CN"/>
+              </w:rPr>
+            </w:pPr>
+          </w:p>
+        </w:tc>
+        <w:tc>
+          <w:tcPr>
+            <w:tcW w:w="5664" w:type="dxa"/>
+            <w:vAlign w:val="center"/>
+          </w:tcPr>
+          <w:p>
+            <w:pPr>
+              <w:spacing w:after="0"/>
+              <w:rPr>
+                <w:sz w:val="16"/>
+              </w:rPr>
+            </w:pPr>
+          </w:p>
+        </w:tc>
+        <w:tc>
+          <w:tcPr>
+            <w:tcW w:w="2847" w:type="dxa"/>
+            <w:vAlign w:val="center"/>
+          </w:tcPr>
+          <w:p>
+            <w:pPr>
+              <w:spacing w:after="0"/>
+              <w:rPr>
+                <w:sz w:val="16"/>
+              </w:rPr>
+            </w:pPr>
+          </w:p>
+        </w:tc>
+      </w:tr>
+      <w:tr>
+        <w:trPr>
+          <w:cantSplit/>
+          <w:jc w:val="center"/>
+        </w:trPr>
+        <w:tc>
+          <w:tcPr>
+            <w:tcW w:w="1559" w:type="dxa"/>
+            <w:vAlign w:val="center"/>
+          </w:tcPr>
+          <w:p>
+            <w:pPr>
+              <w:spacing w:after="0"/>
+              <w:rPr>
+                <w:rFonts w:hint="eastAsia"/>
+                <w:sz w:val="16"/>
+                <w:lang w:eastAsia="zh-CN"/>
+              </w:rPr>
+            </w:pPr>
+          </w:p>
+        </w:tc>
+        <w:tc>
+          <w:tcPr>
+            <w:tcW w:w="5664" w:type="dxa"/>
+            <w:vAlign w:val="center"/>
+          </w:tcPr>
+          <w:p>
+            <w:pPr>
+              <w:spacing w:after="0"/>
+              <w:rPr>
+                <w:sz w:val="16"/>
+              </w:rPr>
+            </w:pPr>
+          </w:p>
+        </w:tc>
+        <w:tc>
+          <w:tcPr>
+            <w:tcW w:w="2847" w:type="dxa"/>
+            <w:vAlign w:val="center"/>
+          </w:tcPr>
+          <w:p>
+            <w:pPr>
+              <w:spacing w:after="0"/>
+              <w:rPr>
+                <w:sz w:val="16"/>
+              </w:rPr>
+            </w:pPr>
           </w:p>
         </w:tc>
       </w:tr>
@@ -3372,7 +3965,18 @@
     <w:p>
       <w:pPr>
         <w:spacing w:after="20"/>
+        <w:rPr>
+          <w:rFonts w:hint="eastAsia"/>
+          <w:lang w:eastAsia="zh-CN"/>
+        </w:rPr>
       </w:pPr>
+      <w:r>
+        <w:rPr>
+          <w:rFonts w:hint="eastAsia"/>
+          <w:lang w:eastAsia="zh-CN"/>
+        </w:rPr>
+        <w:t xml:space="preserve"> </w:t>
+      </w:r>
     </w:p>
     <w:sectPr>
       <w:footerReference w:type="default" r:id="rId8"/>

</xml_diff>